<commit_message>
Clarify analysis pipeline: stability on all prior-to-Bundesliga stats, then redundancy, then pizza charts.
</commit_message>
<xml_diff>
--- a/CONRAD_PROPOSAL.docx
+++ b/CONRAD_PROPOSAL.docx
@@ -124,7 +124,7 @@
           <w:b/>
           <w:bCs/>
         </w:rPr>
-        <w:t xml:space="preserve">into the 1. Bundesliga</w:t>
+        <w:t xml:space="preserve">into the Bundesliga</w:t>
       </w:r>
       <w:r>
         <w:t xml:space="preserve"> </w:t>
@@ -410,39 +410,57 @@
         <w:pStyle w:val="BodyText"/>
       </w:pPr>
       <w:r>
-        <w:t xml:space="preserve">This extends the NYRB scouting-metric framework (stability → redundancy → target),</w:t>
-      </w:r>
-      <w:r>
-        <w:t xml:space="preserve"> </w:t>
-      </w:r>
-      <w:r>
-        <w:rPr>
-          <w:b/>
-          <w:bCs/>
-        </w:rPr>
-        <w:t xml:space="preserve">replacing Transfermarkt market value</w:t>
-      </w:r>
-      <w:r>
-        <w:t xml:space="preserve"> </w:t>
-      </w:r>
-      <w:r>
-        <w:t xml:space="preserve">with a</w:t>
-      </w:r>
-      <w:r>
-        <w:t xml:space="preserve"> </w:t>
-      </w:r>
-      <w:r>
-        <w:rPr>
-          <w:b/>
-          <w:bCs/>
-        </w:rPr>
-        <w:t xml:space="preserve">Destination Effectiveness Score (DES)</w:t>
-      </w:r>
-      <w:r>
-        <w:t xml:space="preserve"> </w:t>
-      </w:r>
-      <w:r>
-        <w:t xml:space="preserve">and a traits-to-target / leagues-to-prioritize framing.</w:t>
+        <w:t xml:space="preserve">This extends the NYRB scouting-metric framework (</w:t>
+      </w:r>
+      <w:r>
+        <w:rPr>
+          <w:b/>
+          <w:bCs/>
+        </w:rPr>
+        <w:t xml:space="preserve">stability → redundancy → pizza / profiles</w:t>
+      </w:r>
+      <w:r>
+        <w:t xml:space="preserve">), focused on</w:t>
+      </w:r>
+      <w:r>
+        <w:t xml:space="preserve"> </w:t>
+      </w:r>
+      <w:r>
+        <w:rPr>
+          <w:b/>
+          <w:bCs/>
+        </w:rPr>
+        <w:t xml:space="preserve">which stats travel well</w:t>
+      </w:r>
+      <w:r>
+        <w:t xml:space="preserve"> </w:t>
+      </w:r>
+      <w:r>
+        <w:t xml:space="preserve">from the prior league into the Bundesliga — not Transfermarkt market value.</w:t>
+      </w:r>
+    </w:p>
+    <w:p>
+      <w:pPr>
+        <w:pStyle w:val="BodyText"/>
+      </w:pPr>
+      <w:r>
+        <w:t xml:space="preserve">Inbound players are identified from</w:t>
+      </w:r>
+      <w:r>
+        <w:t xml:space="preserve"> </w:t>
+      </w:r>
+      <w:r>
+        <w:rPr>
+          <w:b/>
+          <w:bCs/>
+        </w:rPr>
+        <w:t xml:space="preserve">FBref season records</w:t>
+      </w:r>
+      <w:r>
+        <w:t xml:space="preserve"> </w:t>
+      </w:r>
+      <w:r>
+        <w:t xml:space="preserve">(first Bundesliga season / prior league ≠ Bundesliga), not from scraped Transfermarkt transfer tables.</w:t>
       </w:r>
     </w:p>
     <w:p>
@@ -523,7 +541,7 @@
               <w:pStyle w:val="Compact"/>
             </w:pPr>
             <w:r>
-              <w:t xml:space="preserve">Yes — the site is free to view (transfers, clubs, minutes, values).</w:t>
+              <w:t xml:space="preserve">Site is free to view (transfers, clubs, minutes, values).</w:t>
             </w:r>
           </w:p>
         </w:tc>
@@ -551,17 +569,7 @@
               <w:pStyle w:val="Compact"/>
             </w:pPr>
             <w:r>
-              <w:rPr>
-                <w:b/>
-                <w:bCs/>
-              </w:rPr>
-              <w:t xml:space="preserve">No</w:t>
-            </w:r>
-            <w:r>
-              <w:t xml:space="preserve"> </w:t>
-            </w:r>
-            <w:r>
-              <w:t xml:space="preserve">— Transfermarkt Terms of Use ban bots, spiders, and screen scraping, and reserve text/data-mining rights.</w:t>
+              <w:t xml:space="preserve">Transfermarkt Terms of Use ban bots, spiders, and screen scraping, and reserve text/data-mining rights.</w:t>
             </w:r>
           </w:p>
         </w:tc>
@@ -617,23 +625,7 @@
               <w:pStyle w:val="Compact"/>
             </w:pPr>
             <w:r>
-              <w:t xml:space="preserve">Do</w:t>
-            </w:r>
-            <w:r>
-              <w:t xml:space="preserve"> </w:t>
-            </w:r>
-            <w:r>
-              <w:rPr>
-                <w:b/>
-                <w:bCs/>
-              </w:rPr>
-              <w:t xml:space="preserve">not</w:t>
-            </w:r>
-            <w:r>
-              <w:t xml:space="preserve"> </w:t>
-            </w:r>
-            <w:r>
-              <w:t xml:space="preserve">scrape Transfermarkt. Use</w:t>
+              <w:t xml:space="preserve">Use</w:t>
             </w:r>
             <w:r>
               <w:t xml:space="preserve"> </w:t>
@@ -649,7 +641,7 @@
               <w:t xml:space="preserve"> </w:t>
             </w:r>
             <w:r>
-              <w:t xml:space="preserve">as the public performance and season source. Use Transfermarkt only via (a) manual spot-checks, (b) Conrad-approved contact/request, or (c) a pre-published dataset if Conrad signs off.</w:t>
+              <w:t xml:space="preserve">as the public performance and season source. Use Transfermarkt only via (a) manual spot-checks, (b) Approved contact/request, or (c) a pre-published dataset.</w:t>
             </w:r>
           </w:p>
         </w:tc>
@@ -779,13 +771,13 @@
       </w:r>
     </w:p>
     <w:bookmarkEnd w:id="11"/>
-    <w:bookmarkStart w:id="12" w:name="X53b81b8945b83f31bc3fbfc52a7f658cc51d702"/>
+    <w:bookmarkStart w:id="12" w:name="X095f9876a768e899817d57b1d5aefa278dd952f"/>
     <w:p>
       <w:pPr>
         <w:pStyle w:val="Heading3"/>
       </w:pPr>
       <w:r>
-        <w:t xml:space="preserve">Tier 2 — Portability model (FBref primary; StatsBomb deep dive)</w:t>
+        <w:t xml:space="preserve">Tier 2 — Portability pipeline (FBref primary; StatsBomb deep dive)</w:t>
       </w:r>
     </w:p>
     <w:p>
@@ -839,13 +831,29 @@
           <w:b/>
           <w:bCs/>
         </w:rPr>
-        <w:t xml:space="preserve">What:</w:t>
-      </w:r>
-      <w:r>
-        <w:t xml:space="preserve"> </w:t>
-      </w:r>
-      <w:r>
-        <w:t xml:space="preserve">Pre-transfer vs Bundesliga Y1 z-scores / percentiles; portability</w:t>
+        <w:t xml:space="preserve">Pipeline (same order as NYRB):</w:t>
+      </w:r>
+    </w:p>
+    <w:p>
+      <w:pPr>
+        <w:pStyle w:val="Compact"/>
+        <w:numPr>
+          <w:ilvl w:val="1"/>
+          <w:numId w:val="1003"/>
+        </w:numPr>
+      </w:pPr>
+      <w:r>
+        <w:rPr>
+          <w:b/>
+          <w:bCs/>
+        </w:rPr>
+        <w:t xml:space="preserve">Stability</w:t>
+      </w:r>
+      <w:r>
+        <w:t xml:space="preserve"> </w:t>
+      </w:r>
+      <w:r>
+        <w:t xml:space="preserve">— for every FBref per-90 stat, correlate prior-league season vs Bundesliga Year-1 (by position). Keep stats that travel well (high cross-league</w:t>
       </w:r>
       <w:r>
         <w:t xml:space="preserve"> </w:t>
@@ -858,10 +866,61 @@
         <w:t xml:space="preserve">r</w:t>
       </w:r>
       <w:r>
-        <w:t xml:space="preserve"> </w:t>
-      </w:r>
-      <w:r>
-        <w:t xml:space="preserve">by metric × position; source-league ranking; light redundancy screen.</w:t>
+        <w:t xml:space="preserve">).</w:t>
+      </w:r>
+    </w:p>
+    <w:p>
+      <w:pPr>
+        <w:pStyle w:val="Compact"/>
+        <w:numPr>
+          <w:ilvl w:val="1"/>
+          <w:numId w:val="1003"/>
+        </w:numPr>
+      </w:pPr>
+      <w:r>
+        <w:rPr>
+          <w:b/>
+          <w:bCs/>
+        </w:rPr>
+        <w:t xml:space="preserve">Redundancy</w:t>
+      </w:r>
+      <w:r>
+        <w:t xml:space="preserve"> </w:t>
+      </w:r>
+      <w:r>
+        <w:t xml:space="preserve">— among stable stats, drop near-duplicates (|</w:t>
+      </w:r>
+      <w:r>
+        <w:rPr>
+          <w:i/>
+          <w:iCs/>
+        </w:rPr>
+        <w:t xml:space="preserve">r</w:t>
+      </w:r>
+      <w:r>
+        <w:t xml:space="preserve">| ≥ 0.70 within position); keep one representative per cluster.</w:t>
+      </w:r>
+    </w:p>
+    <w:p>
+      <w:pPr>
+        <w:pStyle w:val="Compact"/>
+        <w:numPr>
+          <w:ilvl w:val="1"/>
+          <w:numId w:val="1003"/>
+        </w:numPr>
+      </w:pPr>
+      <w:r>
+        <w:rPr>
+          <w:b/>
+          <w:bCs/>
+        </w:rPr>
+        <w:t xml:space="preserve">Pizza charts</w:t>
+      </w:r>
+      <w:r>
+        <w:t xml:space="preserve"> </w:t>
+      </w:r>
+      <w:r>
+        <w:t xml:space="preserve">— player profiles built only from that stable + non-redundant set (prior vs Bundesliga avg/top reference lines).</w:t>
       </w:r>
     </w:p>
     <w:p>
@@ -877,13 +936,35 @@
           <w:b/>
           <w:bCs/>
         </w:rPr>
+        <w:t xml:space="preserve">Source-league ranking:</w:t>
+      </w:r>
+      <w:r>
+        <w:t xml:space="preserve"> </w:t>
+      </w:r>
+      <w:r>
+        <w:t xml:space="preserve">which prior leagues produce arrivals whose Y1 minutes / profile strength look best on the kept traits.</w:t>
+      </w:r>
+    </w:p>
+    <w:p>
+      <w:pPr>
+        <w:pStyle w:val="Compact"/>
+        <w:numPr>
+          <w:ilvl w:val="0"/>
+          <w:numId w:val="1002"/>
+        </w:numPr>
+      </w:pPr>
+      <w:r>
+        <w:rPr>
+          <w:b/>
+          <w:bCs/>
+        </w:rPr>
         <w:t xml:space="preserve">StatsBomb Open Data deep dive:</w:t>
       </w:r>
       <w:r>
         <w:t xml:space="preserve"> </w:t>
       </w:r>
       <w:r>
-        <w:t xml:space="preserve">Same questions on the ~</w:t>
+        <w:t xml:space="preserve">Same stability → redundancy → pizza sequence on the ~</w:t>
       </w:r>
       <w:r>
         <w:rPr>
@@ -896,7 +977,7 @@
         <w:t xml:space="preserve"> </w:t>
       </w:r>
       <w:r>
-        <w:t xml:space="preserve">players who currently have prior + Bundesliga minutes in open data (richer event taxonomy, interactive pizza profiles). Compare whether event-level conclusions</w:t>
+        <w:t xml:space="preserve">open-data overlap (richer event taxonomy). Check whether Event-level conclusions</w:t>
       </w:r>
       <w:r>
         <w:t xml:space="preserve"> </w:t>
@@ -912,7 +993,7 @@
         <w:t xml:space="preserve"> </w:t>
       </w:r>
       <w:r>
-        <w:t xml:space="preserve">with FBref (validation: deeper but smaller).</w:t>
+        <w:t xml:space="preserve">with FBref.</w:t>
       </w:r>
     </w:p>
     <w:p>
@@ -924,41 +1005,13 @@
           <w:b/>
           <w:bCs/>
         </w:rPr>
-        <w:t xml:space="preserve">Destination Effectiveness Score (replaces market-value Axis 3):</w:t>
-      </w:r>
-    </w:p>
-    <w:p>
-      <w:pPr>
-        <w:pStyle w:val="BodyText"/>
-      </w:pPr>
-      <w:r>
-        <w:t xml:space="preserve">DES_i = Σ_m [ w_m × Pctile_Bundes(m)_i ] / Σ_m w_m</w:t>
-      </w:r>
-    </w:p>
-    <w:p>
-      <w:pPr>
-        <w:pStyle w:val="BodyText"/>
-      </w:pPr>
-      <w:r>
-        <w:t xml:space="preserve">where w_m = max(0, r_port(m)) and r_port is the correlation of pre-transfer vs Year-1 z-scores for metric m.</w:t>
-      </w:r>
-    </w:p>
-    <w:p>
-      <w:pPr>
-        <w:pStyle w:val="BodyText"/>
-      </w:pPr>
-      <w:r>
-        <w:rPr>
-          <w:b/>
-          <w:bCs/>
-        </w:rPr>
         <w:t xml:space="preserve">Outputs:</w:t>
       </w:r>
       <w:r>
         <w:t xml:space="preserve"> </w:t>
       </w:r>
       <w:r>
-        <w:t xml:space="preserve">traits to target (high portability) and leagues to prioritize (high Year-1 minutes / DES among source leagues).</w:t>
+        <w:t xml:space="preserve">traits that transferred well (stability), a short non-redundant scout card (redundancy), interactive pizza charts, and leagues to prioritize.</w:t>
       </w:r>
     </w:p>
     <w:p>
@@ -984,7 +1037,7 @@
         <w:pStyle w:val="Compact"/>
         <w:numPr>
           <w:ilvl w:val="0"/>
-          <w:numId w:val="1003"/>
+          <w:numId w:val="1004"/>
         </w:numPr>
       </w:pPr>
       <w:r>
@@ -998,7 +1051,7 @@
         <w:t xml:space="preserve"> </w:t>
       </w:r>
       <w:r>
-        <w:t xml:space="preserve">— primary layer for Tier 1 (N≥500 outcomes) and Tier 2 (portability at scale).</w:t>
+        <w:t xml:space="preserve">— primary layer for Tier 1 (N≥500 outcomes) and Tier 2 (stability / redundancy / pizza at scale).</w:t>
       </w:r>
       <w:r>
         <w:br/>
@@ -1009,7 +1062,7 @@
         <w:pStyle w:val="Compact"/>
         <w:numPr>
           <w:ilvl w:val="0"/>
-          <w:numId w:val="1003"/>
+          <w:numId w:val="1004"/>
         </w:numPr>
       </w:pPr>
       <w:r>
@@ -1034,7 +1087,7 @@
         <w:pStyle w:val="Compact"/>
         <w:numPr>
           <w:ilvl w:val="0"/>
-          <w:numId w:val="1003"/>
+          <w:numId w:val="1004"/>
         </w:numPr>
       </w:pPr>
       <w:r>
@@ -1214,7 +1267,7 @@
               <w:pStyle w:val="Compact"/>
             </w:pPr>
             <w:r>
-              <w:t xml:space="preserve">This proposal as a Word document for Conrad</w:t>
+              <w:t xml:space="preserve">This proposal as a Word document</w:t>
             </w:r>
           </w:p>
         </w:tc>
@@ -1252,7 +1305,7 @@
               <w:pStyle w:val="Compact"/>
             </w:pPr>
             <w:r>
-              <w:t xml:space="preserve">Player dropdown sorted by position; StatsBomb-style pizza; DES; stock fonts</w:t>
+              <w:t xml:space="preserve">Player dropdown sorted by position; pizza from selected traits; stock fonts</w:t>
             </w:r>
           </w:p>
         </w:tc>
@@ -1290,7 +1343,7 @@
               <w:pStyle w:val="Compact"/>
             </w:pPr>
             <w:r>
-              <w:t xml:space="preserve">Short 6-section method/results brief (Tier tables, traits, leagues, cases)</w:t>
+              <w:t xml:space="preserve">Short method/results brief (tiers, stability, redundancy, leagues, cases)</w:t>
             </w:r>
           </w:p>
         </w:tc>
@@ -1350,23 +1403,6 @@
       </w:tr>
     </w:tbl>
     <w:p>
-      <w:pPr>
-        <w:pStyle w:val="BodyText"/>
-      </w:pPr>
-      <w:r>
-        <w:t xml:space="preserve">All live in:</w:t>
-      </w:r>
-      <w:r>
-        <w:t xml:space="preserve"> </w:t>
-      </w:r>
-      <w:r>
-        <w:rPr>
-          <w:rStyle w:val="VerbatimChar"/>
-        </w:rPr>
-        <w:t xml:space="preserve">cal-bundesliga-transfer-traits/</w:t>
-      </w:r>
-    </w:p>
-    <w:p>
       <w:r>
         <w:pict>
           <v:rect style="width:0;height:1.5pt" o:hralign="center" o:hrstd="t" o:hr="t"/>
@@ -1374,13 +1410,13 @@
       </w:r>
     </w:p>
     <w:bookmarkEnd w:id="15"/>
-    <w:bookmarkStart w:id="16" w:name="timeline-45-weeks"/>
+    <w:bookmarkStart w:id="16" w:name="timeline-3-weeks"/>
     <w:p>
       <w:pPr>
         <w:pStyle w:val="Heading2"/>
       </w:pPr>
       <w:r>
-        <w:t xml:space="preserve">Timeline (≈4–5 weeks)</w:t>
+        <w:t xml:space="preserve">Timeline (≈3 weeks)</w:t>
       </w:r>
     </w:p>
     <w:tbl>
@@ -1440,7 +1476,23 @@
               <w:pStyle w:val="Compact"/>
             </w:pPr>
             <w:r>
-              <w:t xml:space="preserve">FBref Bundesliga cohort freeze (Tier 1 N≥500); document no-scrape policy for Transfermarkt</w:t>
+              <w:t xml:space="preserve">FBref Bundesliga inbound cohort freeze (Tier 1 N≥500); run</w:t>
+            </w:r>
+            <w:r>
+              <w:t xml:space="preserve"> </w:t>
+            </w:r>
+            <w:r>
+              <w:rPr>
+                <w:b/>
+                <w:bCs/>
+              </w:rPr>
+              <w:t xml:space="preserve">stability</w:t>
+            </w:r>
+            <w:r>
+              <w:t xml:space="preserve"> </w:t>
+            </w:r>
+            <w:r>
+              <w:t xml:space="preserve">on all prior→Bundesliga stats</w:t>
             </w:r>
           </w:p>
         </w:tc>
@@ -1464,7 +1516,17 @@
               <w:pStyle w:val="Compact"/>
             </w:pPr>
             <w:r>
-              <w:t xml:space="preserve">Tier 1 outcomes by source league + position</w:t>
+              <w:rPr>
+                <w:b/>
+                <w:bCs/>
+              </w:rPr>
+              <w:t xml:space="preserve">Redundancy</w:t>
+            </w:r>
+            <w:r>
+              <w:t xml:space="preserve"> </w:t>
+            </w:r>
+            <w:r>
+              <w:t xml:space="preserve">on stable set; Tier 1 outcomes by source league + position</w:t>
             </w:r>
           </w:p>
         </w:tc>
@@ -1488,55 +1550,17 @@
               <w:pStyle w:val="Compact"/>
             </w:pPr>
             <w:r>
-              <w:t xml:space="preserve">Tier 2 FBref portability + DES; begin StatsBomb deep dive</w:t>
-            </w:r>
-          </w:p>
-        </w:tc>
-      </w:tr>
-      <w:tr>
-        <w:tc>
-          <w:tcPr/>
-          <w:p>
-            <w:pPr>
-              <w:pStyle w:val="Compact"/>
-            </w:pPr>
-            <w:r>
-              <w:t xml:space="preserve">4</w:t>
-            </w:r>
-          </w:p>
-        </w:tc>
-        <w:tc>
-          <w:tcPr/>
-          <w:p>
-            <w:pPr>
-              <w:pStyle w:val="Compact"/>
-            </w:pPr>
-            <w:r>
-              <w:t xml:space="preserve">Align FBref vs StatsBomb findings; finalize HTML deliverables</w:t>
-            </w:r>
-          </w:p>
-        </w:tc>
-      </w:tr>
-      <w:tr>
-        <w:tc>
-          <w:tcPr/>
-          <w:p>
-            <w:pPr>
-              <w:pStyle w:val="Compact"/>
-            </w:pPr>
-            <w:r>
-              <w:t xml:space="preserve">5</w:t>
-            </w:r>
-          </w:p>
-        </w:tc>
-        <w:tc>
-          <w:tcPr/>
-          <w:p>
-            <w:pPr>
-              <w:pStyle w:val="Compact"/>
-            </w:pPr>
-            <w:r>
-              <w:t xml:space="preserve">Write-up + Conrad review</w:t>
+              <w:rPr>
+                <w:b/>
+                <w:bCs/>
+              </w:rPr>
+              <w:t xml:space="preserve">Pizza charts</w:t>
+            </w:r>
+            <w:r>
+              <w:t xml:space="preserve"> </w:t>
+            </w:r>
+            <w:r>
+              <w:t xml:space="preserve">+ StatsBomb deep-dive check; PPT / HTML deliverable + review</w:t>
             </w:r>
           </w:p>
         </w:tc>
@@ -1550,13 +1574,13 @@
       </w:r>
     </w:p>
     <w:bookmarkEnd w:id="16"/>
-    <w:bookmarkStart w:id="17" w:name="why-this-works-for-1-credit"/>
+    <w:bookmarkStart w:id="17" w:name="why-this-works"/>
     <w:p>
       <w:pPr>
         <w:pStyle w:val="Heading2"/>
       </w:pPr>
       <w:r>
-        <w:t xml:space="preserve">Why this works for 1 credit</w:t>
+        <w:t xml:space="preserve">Why this works?</w:t>
       </w:r>
     </w:p>
     <w:p>
@@ -1564,7 +1588,7 @@
         <w:pStyle w:val="Compact"/>
         <w:numPr>
           <w:ilvl w:val="0"/>
-          <w:numId w:val="1004"/>
+          <w:numId w:val="1005"/>
         </w:numPr>
       </w:pPr>
       <w:r>
@@ -1589,7 +1613,7 @@
         <w:pStyle w:val="Compact"/>
         <w:numPr>
           <w:ilvl w:val="0"/>
-          <w:numId w:val="1004"/>
+          <w:numId w:val="1005"/>
         </w:numPr>
       </w:pPr>
       <w:r>
@@ -1614,7 +1638,7 @@
         <w:pStyle w:val="Compact"/>
         <w:numPr>
           <w:ilvl w:val="0"/>
-          <w:numId w:val="1004"/>
+          <w:numId w:val="1005"/>
         </w:numPr>
       </w:pPr>
       <w:r>
@@ -1622,13 +1646,13 @@
           <w:b/>
           <w:bCs/>
         </w:rPr>
-        <w:t xml:space="preserve">Accurate where it matters:</w:t>
-      </w:r>
-      <w:r>
-        <w:t xml:space="preserve"> </w:t>
-      </w:r>
-      <w:r>
-        <w:t xml:space="preserve">FBref multi-season performance for the robust model; StatsBomb for a smaller, deeper event dive.</w:t>
+        <w:t xml:space="preserve">Clear pipeline:</w:t>
+      </w:r>
+      <w:r>
+        <w:t xml:space="preserve"> </w:t>
+      </w:r>
+      <w:r>
+        <w:t xml:space="preserve">stability on all stats → redundancy → pizzas from the kept set.</w:t>
       </w:r>
       <w:r>
         <w:br/>
@@ -1639,7 +1663,32 @@
         <w:pStyle w:val="Compact"/>
         <w:numPr>
           <w:ilvl w:val="0"/>
-          <w:numId w:val="1004"/>
+          <w:numId w:val="1005"/>
+        </w:numPr>
+      </w:pPr>
+      <w:r>
+        <w:rPr>
+          <w:b/>
+          <w:bCs/>
+        </w:rPr>
+        <w:t xml:space="preserve">Accurate where it matters:</w:t>
+      </w:r>
+      <w:r>
+        <w:t xml:space="preserve"> </w:t>
+      </w:r>
+      <w:r>
+        <w:t xml:space="preserve">FBref multi-season performance for the robust model; StatsBomb for a smaller, deeper event dive.</w:t>
+      </w:r>
+      <w:r>
+        <w:br/>
+      </w:r>
+    </w:p>
+    <w:p>
+      <w:pPr>
+        <w:pStyle w:val="Compact"/>
+        <w:numPr>
+          <w:ilvl w:val="0"/>
+          <w:numId w:val="1005"/>
         </w:numPr>
       </w:pPr>
       <w:r>
@@ -2004,6 +2053,36 @@
     </w:lvlOverride>
   </w:num>
   <w:num w:numId="1004">
+    <w:abstractNumId w:val="99411"/>
+    <w:lvlOverride w:ilvl="0">
+      <w:startOverride w:val="1"/>
+    </w:lvlOverride>
+    <w:lvlOverride w:ilvl="1">
+      <w:startOverride w:val="1"/>
+    </w:lvlOverride>
+    <w:lvlOverride w:ilvl="2">
+      <w:startOverride w:val="1"/>
+    </w:lvlOverride>
+    <w:lvlOverride w:ilvl="3">
+      <w:startOverride w:val="1"/>
+    </w:lvlOverride>
+    <w:lvlOverride w:ilvl="4">
+      <w:startOverride w:val="1"/>
+    </w:lvlOverride>
+    <w:lvlOverride w:ilvl="5">
+      <w:startOverride w:val="1"/>
+    </w:lvlOverride>
+    <w:lvlOverride w:ilvl="6">
+      <w:startOverride w:val="1"/>
+    </w:lvlOverride>
+    <w:lvlOverride w:ilvl="7">
+      <w:startOverride w:val="1"/>
+    </w:lvlOverride>
+    <w:lvlOverride w:ilvl="8">
+      <w:startOverride w:val="1"/>
+    </w:lvlOverride>
+  </w:num>
+  <w:num w:numId="1005">
     <w:abstractNumId w:val="991"/>
   </w:num>
 </w:numbering>

</xml_diff>